<commit_message>
Auto sync 2026-09-14 10:56:35
</commit_message>
<xml_diff>
--- a/04-需求管理/PRD-OMS发货单拆单与合单功能-v1.0.docx
+++ b/04-需求管理/PRD-OMS发货单拆单与合单功能-v1.0.docx
@@ -257,7 +257,7 @@
                 <w:color w:val="243447"/>
                 <w:sz w:val="20"/>
               </w:rPr>
-              <w:t>系统以“当前有效发货单”为操作对象：发货管理统一设置“发货订单 / 旺店通驳回订单”两个Tab。未同步旺店通的发货单在发货订单Tab直接拆合；已同步后仅当主动查询到旺店通状态为“已驳回”时，才在旺店通驳回订单Tab处理。每次拆合生成新的有效发货单，历史关系永久保留。</w:t>
+              <w:t>系统以“当前有效发货单”为操作对象：发货管理统一设置“发货订单 / 旺店通驳回订单”两个Tab。未同步旺店通的发货单可直接拆合；查询到“已驳回”后，可原单重新同步，也可拆单或合单后同步新结果单。每次处理均保留请求与单据关系，历史永久保留。</w:t>
             </w:r>
           </w:p>
         </w:tc>
@@ -316,7 +316,7 @@
           <w:color w:val="243447"/>
           <w:sz w:val="21"/>
         </w:rPr>
-        <w:t>同时，旺店通目前不会主动推送驳回详情。OMS只能通过接口主动查询订单状态，并且仅能获知“已驳回”，无法获得驳回原因、错误类型或拆合建议。因此，需要由业务人员结合订单信息，在OMS内决定并执行拆单或合单。</w:t>
+        <w:t>同时，旺店通目前不会主动推送驳回详情。OMS只能通过接口主动查询订单状态，并且仅能获知“已驳回”，无法获得驳回原因、错误类型或处理建议。因此，需要由业务人员结合订单信息，在OMS内选择直接重新同步、拆单或合单。</w:t>
       </w:r>
     </w:p>
     <w:p>
@@ -441,6 +441,30 @@
           <w:color w:val="243447"/>
           <w:sz w:val="20"/>
         </w:rPr>
+        <w:t>驳回重试：</w:t>
+      </w:r>
+      <w:r>
+        <w:rPr>
+          <w:rFonts w:ascii="Microsoft YaHei" w:hAnsi="Microsoft YaHei" w:eastAsia="Microsoft YaHei"/>
+          <w:color w:val="243447"/>
+          <w:sz w:val="20"/>
+        </w:rPr>
+        <w:t>商品与数量无需调整时，可直接重新同步当前有效发货单，不强制先拆单或合单。</w:t>
+      </w:r>
+    </w:p>
+    <w:p>
+      <w:pPr>
+        <w:pStyle w:val="ListBullet"/>
+        <w:spacing w:after="80" w:line="280" w:lineRule="auto"/>
+        <w:ind w:left="720" w:hanging="360"/>
+      </w:pPr>
+      <w:r>
+        <w:rPr>
+          <w:rFonts w:ascii="Microsoft YaHei" w:hAnsi="Microsoft YaHei" w:eastAsia="Microsoft YaHei"/>
+          <w:b/>
+          <w:color w:val="243447"/>
+          <w:sz w:val="20"/>
+        </w:rPr>
         <w:t>拆单提效：</w:t>
       </w:r>
       <w:r>
@@ -545,7 +569,7 @@
           <w:color w:val="243447"/>
           <w:sz w:val="20"/>
         </w:rPr>
-        <w:t>驳回订单仅区分未处理与已处理；处理完成后统一进入“拆/合单管理”，通过拆单记录、合单记录Tab查看。</w:t>
+        <w:t>驳回订单仅区分未处理与已处理；直接重新同步的请求结果在原驳回记录查看，拆单和合单结果进入“拆/合单管理”。</w:t>
       </w:r>
     </w:p>
     <w:tbl>
@@ -1376,7 +1400,7 @@
                 <w:color w:val="243447"/>
                 <w:sz w:val="17"/>
               </w:rPr>
-              <w:t>统一设置“发货订单 / 旺店通驳回订单”Tab。发货订单Tab支持未同步旺店通的普通发货单、拆单子单、合并发货单直接拆合；旺店通驳回订单Tab展示接口查询到的已驳回订单，人工完成拆合后标记已处理。</w:t>
+              <w:t>统一设置“发货订单 / 旺店通驳回订单”Tab。发货订单Tab支持未同步旺店通的有效发货单直接拆合；旺店通驳回订单Tab提供重新同步、拆单和合单三种处理方式，完成任一处理后标记已处理。</w:t>
             </w:r>
           </w:p>
         </w:tc>
@@ -2719,7 +2743,7 @@
                 <w:color w:val="243447"/>
                 <w:sz w:val="17"/>
               </w:rPr>
-              <w:t>拆单、合单</w:t>
+              <w:t>直接重新同步、拆单、合单</w:t>
             </w:r>
           </w:p>
         </w:tc>
@@ -2785,7 +2809,7 @@
                 <w:color w:val="243447"/>
                 <w:sz w:val="17"/>
               </w:rPr>
-              <w:t>完成后标记已处理</w:t>
+              <w:t>重新同步原单，或生成结果单后同步；本次驳回标记已处理</w:t>
             </w:r>
           </w:p>
         </w:tc>
@@ -2823,7 +2847,7 @@
                 <w:color w:val="243447"/>
                 <w:sz w:val="17"/>
               </w:rPr>
-              <w:t>拆合结果再次被驳回</w:t>
+              <w:t>重新同步或拆合结果再次被驳回</w:t>
             </w:r>
           </w:p>
         </w:tc>
@@ -2856,7 +2880,7 @@
                 <w:color w:val="243447"/>
                 <w:sz w:val="17"/>
               </w:rPr>
-              <w:t>再次拆单或合单</w:t>
+              <w:t>再次重新同步、拆单或合单</w:t>
             </w:r>
           </w:p>
         </w:tc>
@@ -2922,7 +2946,7 @@
                 <w:color w:val="243447"/>
                 <w:sz w:val="17"/>
               </w:rPr>
-              <w:t>新增关系层，不覆盖历史</w:t>
+              <w:t>新增驳回记录并关联上次处理，不覆盖历史</w:t>
             </w:r>
           </w:p>
         </w:tc>
@@ -3643,7 +3667,7 @@
                 <w:color w:val="243447"/>
                 <w:sz w:val="17"/>
               </w:rPr>
-              <w:t>在旺店通驳回订单Tab主动查询状态；仅展示已驳回；完成拆合后直接标记已处理。</w:t>
+              <w:t>在旺店通驳回订单Tab主动查询状态；未处理记录支持直接重新同步、拆单或合单。重新同步不生成新发货单；任一处理提交成功后，本次驳回记录标记已处理。</w:t>
             </w:r>
           </w:p>
         </w:tc>
@@ -4676,7 +4700,7 @@
         <w:drawing>
           <wp:inline xmlns:a="http://schemas.openxmlformats.org/drawingml/2006/main" xmlns:pic="http://schemas.openxmlformats.org/drawingml/2006/picture">
             <wp:extent cx="5897880" cy="2817876"/>
-            <wp:docPr id="1" name="Picture 1" title="总体业务流程图" descr="展示发货管理内发货订单与旺店通驳回订单两个Tab的拆合流程，处理完成后进入拆单或合单结果档案。"/>
+            <wp:docPr id="1" name="Picture 1" title="总体业务流程图" descr="展示发货管理内发货订单与旺店通驳回订单两个Tab的处理流程；驳回订单可直接重新同步，也可拆合后同步新结果单。"/>
             <wp:cNvGraphicFramePr>
               <a:graphicFrameLocks noChangeAspect="1"/>
             </wp:cNvGraphicFramePr>
@@ -4719,7 +4743,7 @@
           <w:color w:val="667085"/>
           <w:sz w:val="18"/>
         </w:rPr>
-        <w:t>图1  发货管理双Tab拆合流程</w:t>
+        <w:t>图1  发货管理双Tab与驳回订单三种处理方式</w:t>
       </w:r>
     </w:p>
     <w:p>
@@ -5020,7 +5044,7 @@
                 <w:color w:val="243447"/>
                 <w:sz w:val="18"/>
               </w:rPr>
-              <w:t>同一页面使用“发货订单 / 旺店通驳回订单”Tab切换。筛选区采用标签在上、输入框在下的紧凑两行布局，搜索、重置、导出按钮固定在右侧。发货订单Tab对未同步单据显示拆单、合单；旺店通驳回订单Tab可主动刷新状态、处理未处理订单，完成后显示已处理和结果入口。</w:t>
+              <w:t>同一页面使用“发货订单 / 旺店通驳回订单”Tab切换。发货订单Tab对未同步单据显示拆单、合单；旺店通驳回订单Tab可主动刷新状态，对未处理记录显示重新同步旺店通、拆单、合单三个操作。直接重新同步后仅显示已处理并保留查看订单入口，不新增同步记录页面；拆合后进入对应结果档案。</w:t>
             </w:r>
           </w:p>
         </w:tc>
@@ -7248,7 +7272,7 @@
           <w:color w:val="243447"/>
           <w:sz w:val="20"/>
         </w:rPr>
-        <w:t>不加锁，采用乐观校验：拆单或合单提交前，再次校验该驳回订单是否仍为未处理；若已由其他人完成，终止本次提交并刷新页面。</w:t>
+        <w:t>未处理的驳回订单提供直接重新同步、拆单和合单三个操作。重新同步沿用当前有效发货单及原商品数量，不生成新发货单。</w:t>
       </w:r>
     </w:p>
     <w:p>
@@ -7263,7 +7287,7 @@
           <w:color w:val="243447"/>
           <w:sz w:val="20"/>
         </w:rPr>
-        <w:t>拆合完成后，来源驳回订单直接标记已处理，并保存处理类型及结果编号。</w:t>
+        <w:t>不加锁，采用乐观校验：任一处理提交前，再次校验该驳回订单仍为未处理、当前发货单仍有效，且售后占用未导致履约数量变化；校验失败时终止提交并保留页面输入。</w:t>
       </w:r>
     </w:p>
     <w:p>
@@ -7278,7 +7302,52 @@
           <w:color w:val="243447"/>
           <w:sz w:val="20"/>
         </w:rPr>
-        <w:t>拆合结果重新同步后发生二次驳回时，新增一条驳回记录，并显示来源拆单/合单编号；不得覆盖前一次驳回历史。</w:t>
+        <w:t>重新同步请求被OMS接口受理，或拆合结果成功生成后，来源驳回记录标记已处理，并保存处理类型、同步请求号或拆合结果编号。</w:t>
+      </w:r>
+    </w:p>
+    <w:p>
+      <w:pPr>
+        <w:pStyle w:val="ListBullet"/>
+        <w:spacing w:after="80" w:line="280" w:lineRule="auto"/>
+        <w:ind w:left="720" w:hanging="360"/>
+      </w:pPr>
+      <w:r>
+        <w:rPr>
+          <w:rFonts w:ascii="Microsoft YaHei" w:hAnsi="Microsoft YaHei" w:eastAsia="Microsoft YaHei"/>
+          <w:color w:val="243447"/>
+          <w:sz w:val="20"/>
+        </w:rPr>
+        <w:t>重新同步提交成功只表示请求已发送，不代表旺店通已接收。OMS继续主动查询；查询为已接收时进入正常发货，查询为已驳回时新增驳回记录。</w:t>
+      </w:r>
+    </w:p>
+    <w:p>
+      <w:pPr>
+        <w:pStyle w:val="ListBullet"/>
+        <w:spacing w:after="80" w:line="280" w:lineRule="auto"/>
+        <w:ind w:left="720" w:hanging="360"/>
+      </w:pPr>
+      <w:r>
+        <w:rPr>
+          <w:rFonts w:ascii="Microsoft YaHei" w:hAnsi="Microsoft YaHei" w:eastAsia="Microsoft YaHei"/>
+          <w:color w:val="243447"/>
+          <w:sz w:val="20"/>
+        </w:rPr>
+        <w:t>页面不新增同步记录功能。重新同步的处理类型和请求号保存在原驳回订单详情及接口日志中；用户仍通过主动查询刷新旺店通状态。</w:t>
+      </w:r>
+    </w:p>
+    <w:p>
+      <w:pPr>
+        <w:pStyle w:val="ListBullet"/>
+        <w:spacing w:after="80" w:line="280" w:lineRule="auto"/>
+        <w:ind w:left="720" w:hanging="360"/>
+      </w:pPr>
+      <w:r>
+        <w:rPr>
+          <w:rFonts w:ascii="Microsoft YaHei" w:hAnsi="Microsoft YaHei" w:eastAsia="Microsoft YaHei"/>
+          <w:color w:val="243447"/>
+          <w:sz w:val="20"/>
+        </w:rPr>
+        <w:t>重新同步或拆合结果再次被驳回时，新增记录并关联上一次驳回记录、处理类型和请求号；不得覆盖历史。</w:t>
       </w:r>
     </w:p>
     <w:p>
@@ -7659,6 +7728,77 @@
                 <w:sz w:val="18"/>
               </w:rPr>
               <w:t>每次向旺店通同步使用唯一且可重复查询的请求号，保证幂等。</w:t>
+            </w:r>
+          </w:p>
+        </w:tc>
+      </w:tr>
+      <w:tr>
+        <w:trPr>
+          <w:cantSplit/>
+        </w:trPr>
+        <w:tc>
+          <w:tcPr>
+            <w:tcW w:type="dxa" w:w="2400"/>
+            <w:tcMar>
+              <w:top w:w="80" w:type="dxa"/>
+              <w:start w:w="120" w:type="dxa"/>
+              <w:bottom w:w="80" w:type="dxa"/>
+              <w:end w:w="120" w:type="dxa"/>
+            </w:tcMar>
+            <w:vAlign w:val="center"/>
+          </w:tcPr>
+          <w:p>
+            <w:pPr>
+              <w:spacing w:before="0" w:after="20" w:line="259" w:lineRule="auto"/>
+            </w:pPr>
+            <w:r>
+              <w:rPr>
+                <w:rFonts w:ascii="Microsoft YaHei" w:hAnsi="Microsoft YaHei" w:eastAsia="Microsoft YaHei"/>
+                <w:color w:val="243447"/>
+                <w:sz w:val="18"/>
+              </w:rPr>
+            </w:r>
+            <w:r>
+              <w:rPr>
+                <w:rFonts w:ascii="Microsoft YaHei" w:hAnsi="Microsoft YaHei" w:eastAsia="Microsoft YaHei"/>
+                <w:b w:val="0"/>
+                <w:color w:val="243447"/>
+                <w:sz w:val="18"/>
+              </w:rPr>
+              <w:t>驳回后重新同步</w:t>
+            </w:r>
+          </w:p>
+        </w:tc>
+        <w:tc>
+          <w:tcPr>
+            <w:tcW w:type="dxa" w:w="6960"/>
+            <w:tcMar>
+              <w:top w:w="80" w:type="dxa"/>
+              <w:start w:w="120" w:type="dxa"/>
+              <w:bottom w:w="80" w:type="dxa"/>
+              <w:end w:w="120" w:type="dxa"/>
+            </w:tcMar>
+            <w:vAlign w:val="center"/>
+          </w:tcPr>
+          <w:p>
+            <w:pPr>
+              <w:spacing w:before="0" w:after="20" w:line="259" w:lineRule="auto"/>
+            </w:pPr>
+            <w:r>
+              <w:rPr>
+                <w:rFonts w:ascii="Microsoft YaHei" w:hAnsi="Microsoft YaHei" w:eastAsia="Microsoft YaHei"/>
+                <w:color w:val="243447"/>
+                <w:sz w:val="18"/>
+              </w:rPr>
+            </w:r>
+            <w:r>
+              <w:rPr>
+                <w:rFonts w:ascii="Microsoft YaHei" w:hAnsi="Microsoft YaHei" w:eastAsia="Microsoft YaHei"/>
+                <w:b w:val="0"/>
+                <w:color w:val="243447"/>
+                <w:sz w:val="18"/>
+              </w:rPr>
+              <w:t>重新同步使用新的同步请求号，但OMS发货单ID保持不变；同一次按钮提交或网络重试复用同一请求号，不得重复创建旺店通订单。</w:t>
             </w:r>
           </w:p>
         </w:tc>
@@ -10725,6 +10865,526 @@
                 <w:color w:val="243447"/>
                 <w:sz w:val="16"/>
               </w:rPr>
+              <w:t>重新同步前订单已由他人处理</w:t>
+            </w:r>
+          </w:p>
+        </w:tc>
+        <w:tc>
+          <w:tcPr>
+            <w:tcW w:type="dxa" w:w="4350"/>
+            <w:tcMar>
+              <w:top w:w="80" w:type="dxa"/>
+              <w:start w:w="120" w:type="dxa"/>
+              <w:bottom w:w="80" w:type="dxa"/>
+              <w:end w:w="120" w:type="dxa"/>
+            </w:tcMar>
+            <w:vAlign w:val="center"/>
+          </w:tcPr>
+          <w:p>
+            <w:pPr>
+              <w:spacing w:before="0" w:after="20" w:line="259" w:lineRule="auto"/>
+            </w:pPr>
+            <w:r>
+              <w:rPr>
+                <w:rFonts w:ascii="Microsoft YaHei" w:hAnsi="Microsoft YaHei" w:eastAsia="Microsoft YaHei"/>
+                <w:color w:val="243447"/>
+                <w:sz w:val="16"/>
+              </w:rPr>
+            </w:r>
+            <w:r>
+              <w:rPr>
+                <w:rFonts w:ascii="Microsoft YaHei" w:hAnsi="Microsoft YaHei" w:eastAsia="Microsoft YaHei"/>
+                <w:b w:val="0"/>
+                <w:color w:val="243447"/>
+                <w:sz w:val="16"/>
+              </w:rPr>
+              <w:t>提交时乐观校验未通过，终止本次请求并刷新记录。</w:t>
+            </w:r>
+          </w:p>
+        </w:tc>
+        <w:tc>
+          <w:tcPr>
+            <w:tcW w:type="dxa" w:w="2260"/>
+            <w:tcMar>
+              <w:top w:w="80" w:type="dxa"/>
+              <w:start w:w="120" w:type="dxa"/>
+              <w:bottom w:w="80" w:type="dxa"/>
+              <w:end w:w="120" w:type="dxa"/>
+            </w:tcMar>
+            <w:vAlign w:val="center"/>
+          </w:tcPr>
+          <w:p>
+            <w:pPr>
+              <w:spacing w:before="0" w:after="20" w:line="259" w:lineRule="auto"/>
+            </w:pPr>
+            <w:r>
+              <w:rPr>
+                <w:rFonts w:ascii="Microsoft YaHei" w:hAnsi="Microsoft YaHei" w:eastAsia="Microsoft YaHei"/>
+                <w:color w:val="243447"/>
+                <w:sz w:val="16"/>
+              </w:rPr>
+            </w:r>
+            <w:r>
+              <w:rPr>
+                <w:rFonts w:ascii="Microsoft YaHei" w:hAnsi="Microsoft YaHei" w:eastAsia="Microsoft YaHei"/>
+                <w:b w:val="0"/>
+                <w:color w:val="243447"/>
+                <w:sz w:val="16"/>
+              </w:rPr>
+              <w:t>订单已由其他人员处理，请查看结果。</w:t>
+            </w:r>
+          </w:p>
+        </w:tc>
+      </w:tr>
+      <w:tr>
+        <w:trPr>
+          <w:cantSplit/>
+        </w:trPr>
+        <w:tc>
+          <w:tcPr>
+            <w:tcW w:type="dxa" w:w="2750"/>
+            <w:tcMar>
+              <w:top w:w="80" w:type="dxa"/>
+              <w:start w:w="120" w:type="dxa"/>
+              <w:bottom w:w="80" w:type="dxa"/>
+              <w:end w:w="120" w:type="dxa"/>
+            </w:tcMar>
+            <w:vAlign w:val="center"/>
+          </w:tcPr>
+          <w:p>
+            <w:pPr>
+              <w:spacing w:before="0" w:after="20" w:line="259" w:lineRule="auto"/>
+            </w:pPr>
+            <w:r>
+              <w:rPr>
+                <w:rFonts w:ascii="Microsoft YaHei" w:hAnsi="Microsoft YaHei" w:eastAsia="Microsoft YaHei"/>
+                <w:color w:val="243447"/>
+                <w:sz w:val="16"/>
+              </w:rPr>
+            </w:r>
+            <w:r>
+              <w:rPr>
+                <w:rFonts w:ascii="Microsoft YaHei" w:hAnsi="Microsoft YaHei" w:eastAsia="Microsoft YaHei"/>
+                <w:b w:val="0"/>
+                <w:color w:val="243447"/>
+                <w:sz w:val="16"/>
+              </w:rPr>
+              <w:t>重新同步前发货单已失效或售后数量变化</w:t>
+            </w:r>
+          </w:p>
+        </w:tc>
+        <w:tc>
+          <w:tcPr>
+            <w:tcW w:type="dxa" w:w="4350"/>
+            <w:tcMar>
+              <w:top w:w="80" w:type="dxa"/>
+              <w:start w:w="120" w:type="dxa"/>
+              <w:bottom w:w="80" w:type="dxa"/>
+              <w:end w:w="120" w:type="dxa"/>
+            </w:tcMar>
+            <w:vAlign w:val="center"/>
+          </w:tcPr>
+          <w:p>
+            <w:pPr>
+              <w:spacing w:before="0" w:after="20" w:line="259" w:lineRule="auto"/>
+            </w:pPr>
+            <w:r>
+              <w:rPr>
+                <w:rFonts w:ascii="Microsoft YaHei" w:hAnsi="Microsoft YaHei" w:eastAsia="Microsoft YaHei"/>
+                <w:color w:val="243447"/>
+                <w:sz w:val="16"/>
+              </w:rPr>
+            </w:r>
+            <w:r>
+              <w:rPr>
+                <w:rFonts w:ascii="Microsoft YaHei" w:hAnsi="Microsoft YaHei" w:eastAsia="Microsoft YaHei"/>
+                <w:b w:val="0"/>
+                <w:color w:val="243447"/>
+                <w:sz w:val="16"/>
+              </w:rPr>
+              <w:t>不发送旺店通请求，保留当前页面并刷新可履约数量。</w:t>
+            </w:r>
+          </w:p>
+        </w:tc>
+        <w:tc>
+          <w:tcPr>
+            <w:tcW w:type="dxa" w:w="2260"/>
+            <w:tcMar>
+              <w:top w:w="80" w:type="dxa"/>
+              <w:start w:w="120" w:type="dxa"/>
+              <w:bottom w:w="80" w:type="dxa"/>
+              <w:end w:w="120" w:type="dxa"/>
+            </w:tcMar>
+            <w:vAlign w:val="center"/>
+          </w:tcPr>
+          <w:p>
+            <w:pPr>
+              <w:spacing w:before="0" w:after="20" w:line="259" w:lineRule="auto"/>
+            </w:pPr>
+            <w:r>
+              <w:rPr>
+                <w:rFonts w:ascii="Microsoft YaHei" w:hAnsi="Microsoft YaHei" w:eastAsia="Microsoft YaHei"/>
+                <w:color w:val="243447"/>
+                <w:sz w:val="16"/>
+              </w:rPr>
+            </w:r>
+            <w:r>
+              <w:rPr>
+                <w:rFonts w:ascii="Microsoft YaHei" w:hAnsi="Microsoft YaHei" w:eastAsia="Microsoft YaHei"/>
+                <w:b w:val="0"/>
+                <w:color w:val="243447"/>
+                <w:sz w:val="16"/>
+              </w:rPr>
+              <w:t>订单状态或可履约数量已变化，请刷新后重新选择处理方式。</w:t>
+            </w:r>
+          </w:p>
+        </w:tc>
+      </w:tr>
+      <w:tr>
+        <w:trPr>
+          <w:cantSplit/>
+        </w:trPr>
+        <w:tc>
+          <w:tcPr>
+            <w:tcW w:type="dxa" w:w="2750"/>
+            <w:tcMar>
+              <w:top w:w="80" w:type="dxa"/>
+              <w:start w:w="120" w:type="dxa"/>
+              <w:bottom w:w="80" w:type="dxa"/>
+              <w:end w:w="120" w:type="dxa"/>
+            </w:tcMar>
+            <w:vAlign w:val="center"/>
+          </w:tcPr>
+          <w:p>
+            <w:pPr>
+              <w:spacing w:before="0" w:after="20" w:line="259" w:lineRule="auto"/>
+            </w:pPr>
+            <w:r>
+              <w:rPr>
+                <w:rFonts w:ascii="Microsoft YaHei" w:hAnsi="Microsoft YaHei" w:eastAsia="Microsoft YaHei"/>
+                <w:color w:val="243447"/>
+                <w:sz w:val="16"/>
+              </w:rPr>
+            </w:r>
+            <w:r>
+              <w:rPr>
+                <w:rFonts w:ascii="Microsoft YaHei" w:hAnsi="Microsoft YaHei" w:eastAsia="Microsoft YaHei"/>
+                <w:b w:val="0"/>
+                <w:color w:val="243447"/>
+                <w:sz w:val="16"/>
+              </w:rPr>
+              <w:t>重新同步接口提交失败</w:t>
+            </w:r>
+          </w:p>
+        </w:tc>
+        <w:tc>
+          <w:tcPr>
+            <w:tcW w:type="dxa" w:w="4350"/>
+            <w:tcMar>
+              <w:top w:w="80" w:type="dxa"/>
+              <w:start w:w="120" w:type="dxa"/>
+              <w:bottom w:w="80" w:type="dxa"/>
+              <w:end w:w="120" w:type="dxa"/>
+            </w:tcMar>
+            <w:vAlign w:val="center"/>
+          </w:tcPr>
+          <w:p>
+            <w:pPr>
+              <w:spacing w:before="0" w:after="20" w:line="259" w:lineRule="auto"/>
+            </w:pPr>
+            <w:r>
+              <w:rPr>
+                <w:rFonts w:ascii="Microsoft YaHei" w:hAnsi="Microsoft YaHei" w:eastAsia="Microsoft YaHei"/>
+                <w:color w:val="243447"/>
+                <w:sz w:val="16"/>
+              </w:rPr>
+            </w:r>
+            <w:r>
+              <w:rPr>
+                <w:rFonts w:ascii="Microsoft YaHei" w:hAnsi="Microsoft YaHei" w:eastAsia="Microsoft YaHei"/>
+                <w:b w:val="0"/>
+                <w:color w:val="243447"/>
+                <w:sz w:val="16"/>
+              </w:rPr>
+              <w:t>本次驳回记录保持未处理，保存失败原因并允许使用同一请求号重试。</w:t>
+            </w:r>
+          </w:p>
+        </w:tc>
+        <w:tc>
+          <w:tcPr>
+            <w:tcW w:type="dxa" w:w="2260"/>
+            <w:tcMar>
+              <w:top w:w="80" w:type="dxa"/>
+              <w:start w:w="120" w:type="dxa"/>
+              <w:bottom w:w="80" w:type="dxa"/>
+              <w:end w:w="120" w:type="dxa"/>
+            </w:tcMar>
+            <w:vAlign w:val="center"/>
+          </w:tcPr>
+          <w:p>
+            <w:pPr>
+              <w:spacing w:before="0" w:after="20" w:line="259" w:lineRule="auto"/>
+            </w:pPr>
+            <w:r>
+              <w:rPr>
+                <w:rFonts w:ascii="Microsoft YaHei" w:hAnsi="Microsoft YaHei" w:eastAsia="Microsoft YaHei"/>
+                <w:color w:val="243447"/>
+                <w:sz w:val="16"/>
+              </w:rPr>
+            </w:r>
+            <w:r>
+              <w:rPr>
+                <w:rFonts w:ascii="Microsoft YaHei" w:hAnsi="Microsoft YaHei" w:eastAsia="Microsoft YaHei"/>
+                <w:b w:val="0"/>
+                <w:color w:val="243447"/>
+                <w:sz w:val="16"/>
+              </w:rPr>
+              <w:t>重新同步失败，请重试；商品和数量未发生变化。</w:t>
+            </w:r>
+          </w:p>
+        </w:tc>
+      </w:tr>
+      <w:tr>
+        <w:trPr>
+          <w:cantSplit/>
+        </w:trPr>
+        <w:tc>
+          <w:tcPr>
+            <w:tcW w:type="dxa" w:w="2750"/>
+            <w:tcMar>
+              <w:top w:w="80" w:type="dxa"/>
+              <w:start w:w="120" w:type="dxa"/>
+              <w:bottom w:w="80" w:type="dxa"/>
+              <w:end w:w="120" w:type="dxa"/>
+            </w:tcMar>
+            <w:vAlign w:val="center"/>
+          </w:tcPr>
+          <w:p>
+            <w:pPr>
+              <w:spacing w:before="0" w:after="20" w:line="259" w:lineRule="auto"/>
+            </w:pPr>
+            <w:r>
+              <w:rPr>
+                <w:rFonts w:ascii="Microsoft YaHei" w:hAnsi="Microsoft YaHei" w:eastAsia="Microsoft YaHei"/>
+                <w:color w:val="243447"/>
+                <w:sz w:val="16"/>
+              </w:rPr>
+            </w:r>
+            <w:r>
+              <w:rPr>
+                <w:rFonts w:ascii="Microsoft YaHei" w:hAnsi="Microsoft YaHei" w:eastAsia="Microsoft YaHei"/>
+                <w:b w:val="0"/>
+                <w:color w:val="243447"/>
+                <w:sz w:val="16"/>
+              </w:rPr>
+              <w:t>重新同步请求重复提交</w:t>
+            </w:r>
+          </w:p>
+        </w:tc>
+        <w:tc>
+          <w:tcPr>
+            <w:tcW w:type="dxa" w:w="4350"/>
+            <w:tcMar>
+              <w:top w:w="80" w:type="dxa"/>
+              <w:start w:w="120" w:type="dxa"/>
+              <w:bottom w:w="80" w:type="dxa"/>
+              <w:end w:w="120" w:type="dxa"/>
+            </w:tcMar>
+            <w:vAlign w:val="center"/>
+          </w:tcPr>
+          <w:p>
+            <w:pPr>
+              <w:spacing w:before="0" w:after="20" w:line="259" w:lineRule="auto"/>
+            </w:pPr>
+            <w:r>
+              <w:rPr>
+                <w:rFonts w:ascii="Microsoft YaHei" w:hAnsi="Microsoft YaHei" w:eastAsia="Microsoft YaHei"/>
+                <w:color w:val="243447"/>
+                <w:sz w:val="16"/>
+              </w:rPr>
+            </w:r>
+            <w:r>
+              <w:rPr>
+                <w:rFonts w:ascii="Microsoft YaHei" w:hAnsi="Microsoft YaHei" w:eastAsia="Microsoft YaHei"/>
+                <w:b w:val="0"/>
+                <w:color w:val="243447"/>
+                <w:sz w:val="16"/>
+              </w:rPr>
+              <w:t>按OMS发货单ID和本次业务请求号进行幂等校验，返回首次提交结果。</w:t>
+            </w:r>
+          </w:p>
+        </w:tc>
+        <w:tc>
+          <w:tcPr>
+            <w:tcW w:type="dxa" w:w="2260"/>
+            <w:tcMar>
+              <w:top w:w="80" w:type="dxa"/>
+              <w:start w:w="120" w:type="dxa"/>
+              <w:bottom w:w="80" w:type="dxa"/>
+              <w:end w:w="120" w:type="dxa"/>
+            </w:tcMar>
+            <w:vAlign w:val="center"/>
+          </w:tcPr>
+          <w:p>
+            <w:pPr>
+              <w:spacing w:before="0" w:after="20" w:line="259" w:lineRule="auto"/>
+            </w:pPr>
+            <w:r>
+              <w:rPr>
+                <w:rFonts w:ascii="Microsoft YaHei" w:hAnsi="Microsoft YaHei" w:eastAsia="Microsoft YaHei"/>
+                <w:color w:val="243447"/>
+                <w:sz w:val="16"/>
+              </w:rPr>
+            </w:r>
+            <w:r>
+              <w:rPr>
+                <w:rFonts w:ascii="Microsoft YaHei" w:hAnsi="Microsoft YaHei" w:eastAsia="Microsoft YaHei"/>
+                <w:b w:val="0"/>
+                <w:color w:val="243447"/>
+                <w:sz w:val="16"/>
+              </w:rPr>
+              <w:t>已提交重新同步，请勿重复操作。</w:t>
+            </w:r>
+          </w:p>
+        </w:tc>
+      </w:tr>
+      <w:tr>
+        <w:trPr>
+          <w:cantSplit/>
+        </w:trPr>
+        <w:tc>
+          <w:tcPr>
+            <w:tcW w:type="dxa" w:w="2750"/>
+            <w:tcMar>
+              <w:top w:w="80" w:type="dxa"/>
+              <w:start w:w="120" w:type="dxa"/>
+              <w:bottom w:w="80" w:type="dxa"/>
+              <w:end w:w="120" w:type="dxa"/>
+            </w:tcMar>
+            <w:vAlign w:val="center"/>
+          </w:tcPr>
+          <w:p>
+            <w:pPr>
+              <w:spacing w:before="0" w:after="20" w:line="259" w:lineRule="auto"/>
+            </w:pPr>
+            <w:r>
+              <w:rPr>
+                <w:rFonts w:ascii="Microsoft YaHei" w:hAnsi="Microsoft YaHei" w:eastAsia="Microsoft YaHei"/>
+                <w:color w:val="243447"/>
+                <w:sz w:val="16"/>
+              </w:rPr>
+            </w:r>
+            <w:r>
+              <w:rPr>
+                <w:rFonts w:ascii="Microsoft YaHei" w:hAnsi="Microsoft YaHei" w:eastAsia="Microsoft YaHei"/>
+                <w:b w:val="0"/>
+                <w:color w:val="243447"/>
+                <w:sz w:val="16"/>
+              </w:rPr>
+              <w:t>重新同步后再次被驳回</w:t>
+            </w:r>
+          </w:p>
+        </w:tc>
+        <w:tc>
+          <w:tcPr>
+            <w:tcW w:type="dxa" w:w="4350"/>
+            <w:tcMar>
+              <w:top w:w="80" w:type="dxa"/>
+              <w:start w:w="120" w:type="dxa"/>
+              <w:bottom w:w="80" w:type="dxa"/>
+              <w:end w:w="120" w:type="dxa"/>
+            </w:tcMar>
+            <w:vAlign w:val="center"/>
+          </w:tcPr>
+          <w:p>
+            <w:pPr>
+              <w:spacing w:before="0" w:after="20" w:line="259" w:lineRule="auto"/>
+            </w:pPr>
+            <w:r>
+              <w:rPr>
+                <w:rFonts w:ascii="Microsoft YaHei" w:hAnsi="Microsoft YaHei" w:eastAsia="Microsoft YaHei"/>
+                <w:color w:val="243447"/>
+                <w:sz w:val="16"/>
+              </w:rPr>
+            </w:r>
+            <w:r>
+              <w:rPr>
+                <w:rFonts w:ascii="Microsoft YaHei" w:hAnsi="Microsoft YaHei" w:eastAsia="Microsoft YaHei"/>
+                <w:b w:val="0"/>
+                <w:color w:val="243447"/>
+                <w:sz w:val="16"/>
+              </w:rPr>
+              <w:t>新增驳回记录并关联上一次驳回记录和同步请求号。</w:t>
+            </w:r>
+          </w:p>
+        </w:tc>
+        <w:tc>
+          <w:tcPr>
+            <w:tcW w:type="dxa" w:w="2260"/>
+            <w:tcMar>
+              <w:top w:w="80" w:type="dxa"/>
+              <w:start w:w="120" w:type="dxa"/>
+              <w:bottom w:w="80" w:type="dxa"/>
+              <w:end w:w="120" w:type="dxa"/>
+            </w:tcMar>
+            <w:vAlign w:val="center"/>
+          </w:tcPr>
+          <w:p>
+            <w:pPr>
+              <w:spacing w:before="0" w:after="20" w:line="259" w:lineRule="auto"/>
+            </w:pPr>
+            <w:r>
+              <w:rPr>
+                <w:rFonts w:ascii="Microsoft YaHei" w:hAnsi="Microsoft YaHei" w:eastAsia="Microsoft YaHei"/>
+                <w:color w:val="243447"/>
+                <w:sz w:val="16"/>
+              </w:rPr>
+            </w:r>
+            <w:r>
+              <w:rPr>
+                <w:rFonts w:ascii="Microsoft YaHei" w:hAnsi="Microsoft YaHei" w:eastAsia="Microsoft YaHei"/>
+                <w:b w:val="0"/>
+                <w:color w:val="243447"/>
+                <w:sz w:val="16"/>
+              </w:rPr>
+              <w:t>订单再次被旺店通驳回，可重新同步、拆单或合单。</w:t>
+            </w:r>
+          </w:p>
+        </w:tc>
+      </w:tr>
+      <w:tr>
+        <w:trPr>
+          <w:cantSplit/>
+        </w:trPr>
+        <w:tc>
+          <w:tcPr>
+            <w:tcW w:type="dxa" w:w="2750"/>
+            <w:tcMar>
+              <w:top w:w="80" w:type="dxa"/>
+              <w:start w:w="120" w:type="dxa"/>
+              <w:bottom w:w="80" w:type="dxa"/>
+              <w:end w:w="120" w:type="dxa"/>
+            </w:tcMar>
+            <w:vAlign w:val="center"/>
+          </w:tcPr>
+          <w:p>
+            <w:pPr>
+              <w:spacing w:before="0" w:after="20" w:line="259" w:lineRule="auto"/>
+            </w:pPr>
+            <w:r>
+              <w:rPr>
+                <w:rFonts w:ascii="Microsoft YaHei" w:hAnsi="Microsoft YaHei" w:eastAsia="Microsoft YaHei"/>
+                <w:color w:val="243447"/>
+                <w:sz w:val="16"/>
+              </w:rPr>
+            </w:r>
+            <w:r>
+              <w:rPr>
+                <w:rFonts w:ascii="Microsoft YaHei" w:hAnsi="Microsoft YaHei" w:eastAsia="Microsoft YaHei"/>
+                <w:b w:val="0"/>
+                <w:color w:val="243447"/>
+                <w:sz w:val="16"/>
+              </w:rPr>
               <w:t>拆单数量为小数、负数或空</w:t>
             </w:r>
           </w:p>
@@ -13863,7 +14523,7 @@
           <w:color w:val="243447"/>
           <w:sz w:val="20"/>
         </w:rPr>
-        <w:t>发货管理统一为“发货订单 / 旺店通驳回订单”双Tab：前者承担未同步订单的拆合，后者承担已同步后被驳回订单的处理。</w:t>
+        <w:t>发货管理统一为“发货订单 / 旺店通驳回订单”双Tab：前者承担未同步订单的拆合，后者提供直接重新同步、拆单和合单三种驳回处理方式。</w:t>
       </w:r>
     </w:p>
     <w:p>
@@ -14146,7 +14806,7 @@
                 <w:color w:val="243447"/>
                 <w:sz w:val="18"/>
               </w:rPr>
-              <w:t>同步对象从原订单固定映射改为当前有效发货单；保存多次历史同步关系。</w:t>
+              <w:t>同步对象从原订单固定映射改为当前有效发货单；驳回后可用新的同步请求号重新提交同一发货单，并保存历次请求及查询结果。</w:t>
             </w:r>
           </w:p>
         </w:tc>
@@ -14288,7 +14948,7 @@
                 <w:color w:val="243447"/>
                 <w:sz w:val="18"/>
               </w:rPr>
-              <w:t>合并发货订单与旺店通驳回订单入口为双Tab；根据是否未同步、是否当前有效控制拆单/合单按钮，并分别保留Tab查询条件。</w:t>
+              <w:t>驳回订单操作区增加重新同步旺店通；确认弹窗说明不生成新发货单及后续查询规则。处理后沿用原订单详情，不增加同步记录页面。</w:t>
             </w:r>
           </w:p>
         </w:tc>
@@ -14700,7 +15360,7 @@
           <w:color w:val="243447"/>
           <w:sz w:val="20"/>
         </w:rPr>
-        <w:t>开放同页旺店通驳回订单Tab拆合，并监控新结果单同步成功率和再次驳回率。</w:t>
+        <w:t>开放同页旺店通驳回订单Tab的直接重新同步、拆单和合单，并分别监控原单重试与新结果单的接收率、再次驳回率。</w:t>
       </w:r>
     </w:p>
     <w:p>
@@ -15007,7 +15667,7 @@
                 <w:color w:val="243447"/>
                 <w:sz w:val="16"/>
               </w:rPr>
-              <w:t>确认售后数据字段、完成后推送时点、单条数据约束、幂等字段、结果查询与失败重试能力。</w:t>
+              <w:t>确认已驳回订单能否以同一OMS发货单ID和新的请求号重新提交，以及幂等、结果查询、失败重试和售后推送能力。</w:t>
             </w:r>
           </w:p>
         </w:tc>
@@ -15111,7 +15771,7 @@
                 <w:color w:val="243447"/>
                 <w:sz w:val="16"/>
               </w:rPr>
-              <w:t>发货单重组与关系模型</w:t>
+              <w:t>发货单处理与关系模型</w:t>
             </w:r>
           </w:p>
         </w:tc>
@@ -15144,7 +15804,7 @@
                 <w:color w:val="243447"/>
                 <w:sz w:val="16"/>
               </w:rPr>
-              <w:t>拆合事务、当前有效标识、商品来源映射、唯一约束和接口日志。</w:t>
+              <w:t>实现驳回原单重新同步、请求幂等、处理结果记录，以及拆合事务、当前有效标识、商品来源映射和接口日志。</w:t>
             </w:r>
           </w:p>
         </w:tc>
@@ -15248,7 +15908,7 @@
                 <w:color w:val="243447"/>
                 <w:sz w:val="16"/>
               </w:rPr>
-              <w:t>发货管理、拆合弹窗、结果档案及售后页面</w:t>
+              <w:t>发货管理、驳回重同步、拆合弹窗、结果档案及售后页面</w:t>
             </w:r>
           </w:p>
         </w:tc>
@@ -15281,7 +15941,7 @@
                 <w:color w:val="243447"/>
                 <w:sz w:val="16"/>
               </w:rPr>
-              <w:t>完成Tab切换与查询条件保留、温层快捷/自定义拆分、售后订单列表、紧凑型申请售后弹窗、数量/金额校验、详情和推送结果展示。</w:t>
+              <w:t>在驳回订单行和详情中增加重新同步入口、确认弹窗、提交反馈与结果查看；同时完成拆合及售后页面交互。</w:t>
             </w:r>
           </w:p>
         </w:tc>
@@ -15829,7 +16489,7 @@
                 <w:color w:val="243447"/>
                 <w:sz w:val="16"/>
               </w:rPr>
-              <w:t>覆盖前置拆合、驳回拆合、多级拆合、两类售后申请、数量/金额边界、重复提交、售后完成推送1条、重复完成事件幂等及推送失败重试。</w:t>
+              <w:t>覆盖驳回后直接重同步、提交失败、重复点击、并发处理、再次驳回，以及前置拆合、多级拆合和售后推送。</w:t>
             </w:r>
           </w:p>
         </w:tc>
@@ -16179,6 +16839,21 @@
           <w:sz w:val="20"/>
         </w:rPr>
         <w:t>同步旺店通时可携带的OMS发货单唯一标识、请求号和来源订单号字段。</w:t>
+      </w:r>
+    </w:p>
+    <w:p>
+      <w:pPr>
+        <w:pStyle w:val="ListBullet"/>
+        <w:spacing w:after="80" w:line="280" w:lineRule="auto"/>
+        <w:ind w:left="720" w:hanging="360"/>
+      </w:pPr>
+      <w:r>
+        <w:rPr>
+          <w:rFonts w:ascii="Microsoft YaHei" w:hAnsi="Microsoft YaHei" w:eastAsia="Microsoft YaHei"/>
+          <w:color w:val="243447"/>
+          <w:sz w:val="20"/>
+        </w:rPr>
+        <w:t>已驳回订单直接重新同步时，旺店通是否允许沿用原业务单号，以及新请求与原旺店通单号的关联和去重规则。</w:t>
       </w:r>
     </w:p>
     <w:p>
@@ -16308,7 +16983,7 @@
                 <w:color w:val="243447"/>
                 <w:sz w:val="20"/>
               </w:rPr>
-              <w:t>本期按P0范围建设“OMS当前有效发货单重组”能力，发货管理通过“发货订单 / 旺店通驳回订单”两个Tab承载拆合操作；拆/合单管理作为统一完成结果档案，通过拆单记录、合单记录Tab切换。上线前必须完成数据关系、状态准入、幂等和端到端映射验收。</w:t>
+              <w:t>本期按P0范围建设“OMS当前有效发货单处理”能力。旺店通驳回订单支持直接重新同步、拆单和合单；拆/合单管理继续作为重组结果档案。上线前必须确认旺店通重同步规则，并完成状态准入、请求幂等、再次驳回和端到端映射验收。</w:t>
             </w:r>
           </w:p>
         </w:tc>

</xml_diff>